<commit_message>
TNBC: make the docking run deterministic (--seed 42) and Q2 CSV-driven
run_real_vina_docking.py now passes --seed 42, so the pipeline is
bit-reproducible: re-running it no longer perturbs vina_4UND_kcal_mol by
~0.1 kcal/mol each time. Master table + all figures regenerated from the
seeded run (n=30, mean -7.29, range -4.48..-8.73).

The manuscript's nested-CV Q2 values are now computed inline from the master
table (same protocol as Figure 7), so text / Table 2 / Figure 7 can't drift.
With the seeded docking data the PARP1 Vina endpoint gives Q2_CV = -0.33
(was quoted as +0.11 from the earlier unseeded run); the physisorption
endpoint stays Q2_CV = 0.00 (n=25). Conclusion is unchanged: neither
descriptor QSPR is predictive, the model-free physisorption/chemisorption
split is the robust result. The 2.6 MLR equations are OLS fits recomputed
from the same table.

Verified: full run_entire_study.py end-to-end, 10/10 steps green.

Co-Authored-By: Claude Sonnet 5 <noreply@anthropic.com>
</commit_message>
<xml_diff>
--- a/manuscript/TNBC_Nanocage_Supporting_Information.docx
+++ b/manuscript/TNBC_Nanocage_Supporting_Information.docx
@@ -282,7 +282,7 @@
               <w:rPr>
                 <w:sz w:val="14"/>
               </w:rPr>
-              <w:t>-8.79</w:t>
+              <w:t>-8.73</w:t>
             </w:r>
           </w:p>
         </w:tc>
@@ -388,7 +388,7 @@
               <w:rPr>
                 <w:sz w:val="14"/>
               </w:rPr>
-              <w:t>-7.89</w:t>
+              <w:t>-7.91</w:t>
             </w:r>
           </w:p>
         </w:tc>
@@ -494,7 +494,7 @@
               <w:rPr>
                 <w:sz w:val="14"/>
               </w:rPr>
-              <w:t>-6.03</w:t>
+              <w:t>-6.10</w:t>
             </w:r>
           </w:p>
         </w:tc>
@@ -600,7 +600,7 @@
               <w:rPr>
                 <w:sz w:val="14"/>
               </w:rPr>
-              <w:t>-7.50</w:t>
+              <w:t>-7.56</w:t>
             </w:r>
           </w:p>
         </w:tc>
@@ -706,7 +706,7 @@
               <w:rPr>
                 <w:sz w:val="14"/>
               </w:rPr>
-              <w:t>-6.33</w:t>
+              <w:t>-6.37</w:t>
             </w:r>
           </w:p>
         </w:tc>
@@ -812,7 +812,7 @@
               <w:rPr>
                 <w:sz w:val="14"/>
               </w:rPr>
-              <w:t>-7.76</w:t>
+              <w:t>-7.79</w:t>
             </w:r>
           </w:p>
         </w:tc>
@@ -1236,7 +1236,7 @@
               <w:rPr>
                 <w:sz w:val="14"/>
               </w:rPr>
-              <w:t>-6.01</w:t>
+              <w:t>-6.32</w:t>
             </w:r>
           </w:p>
         </w:tc>
@@ -1342,7 +1342,7 @@
               <w:rPr>
                 <w:sz w:val="14"/>
               </w:rPr>
-              <w:t>-7.42</w:t>
+              <w:t>-7.54</w:t>
             </w:r>
           </w:p>
         </w:tc>
@@ -1448,7 +1448,7 @@
               <w:rPr>
                 <w:sz w:val="14"/>
               </w:rPr>
-              <w:t>-6.77</w:t>
+              <w:t>-6.90</w:t>
             </w:r>
           </w:p>
         </w:tc>
@@ -1554,7 +1554,7 @@
               <w:rPr>
                 <w:sz w:val="14"/>
               </w:rPr>
-              <w:t>-6.88</w:t>
+              <w:t>-6.87</w:t>
             </w:r>
           </w:p>
         </w:tc>
@@ -1660,7 +1660,7 @@
               <w:rPr>
                 <w:sz w:val="14"/>
               </w:rPr>
-              <w:t>-7.17</w:t>
+              <w:t>-7.15</w:t>
             </w:r>
           </w:p>
         </w:tc>
@@ -1766,7 +1766,7 @@
               <w:rPr>
                 <w:sz w:val="14"/>
               </w:rPr>
-              <w:t>-7.25</w:t>
+              <w:t>-7.27</w:t>
             </w:r>
           </w:p>
         </w:tc>
@@ -1872,7 +1872,7 @@
               <w:rPr>
                 <w:sz w:val="14"/>
               </w:rPr>
-              <w:t>-7.99</w:t>
+              <w:t>-7.98</w:t>
             </w:r>
           </w:p>
         </w:tc>
@@ -1978,7 +1978,7 @@
               <w:rPr>
                 <w:sz w:val="14"/>
               </w:rPr>
-              <w:t>-7.90</w:t>
+              <w:t>-7.91</w:t>
             </w:r>
           </w:p>
         </w:tc>
@@ -2084,7 +2084,7 @@
               <w:rPr>
                 <w:sz w:val="14"/>
               </w:rPr>
-              <w:t>-8.01</w:t>
+              <w:t>-7.99</w:t>
             </w:r>
           </w:p>
         </w:tc>
@@ -2190,7 +2190,7 @@
               <w:rPr>
                 <w:sz w:val="14"/>
               </w:rPr>
-              <w:t>-7.80</w:t>
+              <w:t>-7.81</w:t>
             </w:r>
           </w:p>
         </w:tc>
@@ -2402,7 +2402,7 @@
               <w:rPr>
                 <w:sz w:val="14"/>
               </w:rPr>
-              <w:t>-8.46</w:t>
+              <w:t>-8.44</w:t>
             </w:r>
           </w:p>
         </w:tc>
@@ -2508,7 +2508,7 @@
               <w:rPr>
                 <w:sz w:val="14"/>
               </w:rPr>
-              <w:t>-8.04</w:t>
+              <w:t>-7.87</w:t>
             </w:r>
           </w:p>
         </w:tc>
@@ -2614,7 +2614,7 @@
               <w:rPr>
                 <w:sz w:val="14"/>
               </w:rPr>
-              <w:t>-7.93</w:t>
+              <w:t>-7.95</w:t>
             </w:r>
           </w:p>
         </w:tc>
@@ -2720,7 +2720,7 @@
               <w:rPr>
                 <w:sz w:val="14"/>
               </w:rPr>
-              <w:t>-7.05</w:t>
+              <w:t>-7.09</w:t>
             </w:r>
           </w:p>
         </w:tc>
@@ -2826,7 +2826,7 @@
               <w:rPr>
                 <w:sz w:val="14"/>
               </w:rPr>
-              <w:t>-7.18</w:t>
+              <w:t>-7.22</w:t>
             </w:r>
           </w:p>
         </w:tc>
@@ -3038,7 +3038,7 @@
               <w:rPr>
                 <w:sz w:val="14"/>
               </w:rPr>
-              <w:t>-8.01</w:t>
+              <w:t>-7.98</w:t>
             </w:r>
           </w:p>
         </w:tc>
@@ -3250,7 +3250,7 @@
               <w:rPr>
                 <w:sz w:val="14"/>
               </w:rPr>
-              <w:t>-4.61</w:t>
+              <w:t>-4.48</w:t>
             </w:r>
           </w:p>
         </w:tc>
@@ -3356,7 +3356,7 @@
               <w:rPr>
                 <w:sz w:val="14"/>
               </w:rPr>
-              <w:t>-6.34</w:t>
+              <w:t>-6.31</w:t>
             </w:r>
           </w:p>
         </w:tc>
@@ -3462,7 +3462,7 @@
               <w:rPr>
                 <w:sz w:val="14"/>
               </w:rPr>
-              <w:t>-7.33</w:t>
+              <w:t>-7.23</w:t>
             </w:r>
           </w:p>
         </w:tc>
@@ -3568,7 +3568,7 @@
               <w:rPr>
                 <w:sz w:val="14"/>
               </w:rPr>
-              <w:t>-6.96</w:t>
+              <w:t>-6.95</w:t>
             </w:r>
           </w:p>
         </w:tc>
@@ -3674,7 +3674,7 @@
               <w:rPr>
                 <w:sz w:val="14"/>
               </w:rPr>
-              <w:t>-7.08</w:t>
+              <w:t>-7.31</w:t>
             </w:r>
           </w:p>
         </w:tc>

</xml_diff>